<commit_message>
docs: guida dipendenti con equilibrio Acquasanta/Venarotta, senza la parte sulle email
Co-Authored-By: Claude Opus 5.5 <noreply@anthropic.com>
Claude-Session: https://claude.ai/code/session_01PFwBzmVhyMvYuVHv2ms2Dj
</commit_message>
<xml_diff>
--- a/docs/CVAP-Turnistica-Guida-per-i-dipendenti.docx
+++ b/docs/CVAP-Turnistica-Guida-per-i-dipendenti.docx
@@ -637,7 +637,7 @@
               <w:rPr>
                 <w:rStyle w:val="IndexLink"/>
               </w:rPr>
-              <w:t xml:space="default">8.1 Cosa conta di più</w:t>
+              <w:t xml:space="default">8.1 Equilibrio tra Acquasanta e Venarotta</w:t>
               <w:tab/>
               <w:t xml:space="default">8</w:t>
             </w:r>
@@ -645,9 +645,9 @@
         </w:p>
         <w:p>
           <w:pPr>
-            <w:pStyle w:val="TOC1"/>
+            <w:pStyle w:val="TOC2"/>
             <w:tabs>
-              <w:tab w:val="clear" w:pos="9026"/>
+              <w:tab w:val="clear" w:pos="8786"/>
               <w:tab w:val="right" w:pos="9025" w:leader="dot"/>
             </w:tabs>
           </w:pPr>
@@ -656,9 +656,9 @@
               <w:rPr>
                 <w:rStyle w:val="IndexLink"/>
               </w:rPr>
-              <w:t xml:space="default">9. Come ricevi i turni</w:t>
+              <w:t xml:space="default">8.2 Cosa conta di più</w:t>
               <w:tab/>
-              <w:t xml:space="default">8</w:t>
+              <w:t xml:space="default">9</w:t>
             </w:r>
           </w:hyperlink>
         </w:p>
@@ -675,7 +675,7 @@
               <w:rPr>
                 <w:rStyle w:val="IndexLink"/>
               </w:rPr>
-              <w:t xml:space="default">10. Domande frequenti</w:t>
+              <w:t xml:space="default">9. Domande frequenti</w:t>
               <w:tab/>
               <w:t xml:space="default">9</w:t>
             </w:r>
@@ -694,9 +694,9 @@
               <w:rPr>
                 <w:rStyle w:val="IndexLink"/>
               </w:rPr>
-              <w:t xml:space="default">11. Le regole in una pagina</w:t>
+              <w:t xml:space="default">10. Le regole in una pagina</w:t>
               <w:tab/>
-              <w:t xml:space="default">10</w:t>
+              <w:t xml:space="default">11</w:t>
             </w:r>
           </w:hyperlink>
           <w:r>
@@ -837,7 +837,17 @@
         <w:t xml:space="preserve">anche nel corso delle settimane</w:t>
       </w:r>
       <w:r>
-        <w:t xml:space="preserve">, ore, notti, weekend e turni di Standby e Programmati.</w:t>
+        <w:t xml:space="preserve">, ore, notti, weekend, turni di Standby e Programmati e turni tra </w:t>
+      </w:r>
+      <w:r>
+        <w:rPr>
+          <w:b/>
+          <w:bCs/>
+        </w:rPr>
+        <w:t xml:space="preserve">Acquasanta e Venarotta</w:t>
+      </w:r>
+      <w:r>
+        <w:t xml:space="preserve">.</w:t>
       </w:r>
     </w:p>
     <w:p>
@@ -850,7 +860,7 @@
         <w:spacing w:after="70"/>
       </w:pPr>
       <w:r>
-        <w:t xml:space="preserve">Il responsabile dei turni controlla il risultato, lo corregge se serve e conferma la settimana; dopo la conferma ricevi i tuoi turni per email.</w:t>
+        <w:t xml:space="preserve">Il responsabile dei turni controlla il risultato, lo corregge se serve e conferma la settimana.</w:t>
       </w:r>
     </w:p>
     <w:p>
@@ -887,6 +897,8 @@
     <w:p>
       <w:pPr>
         <w:pStyle w:val="ListParagraph"/>
+        <w:keepNext w:val="false"/>
+        <w:keepLines w:val="false"/>
         <w:numPr>
           <w:ilvl w:val="0"/>
           <w:numId w:val="3"/>
@@ -907,6 +919,8 @@
     <w:p>
       <w:pPr>
         <w:pStyle w:val="ListParagraph"/>
+        <w:keepNext w:val="false"/>
+        <w:keepLines w:val="false"/>
         <w:numPr>
           <w:ilvl w:val="0"/>
           <w:numId w:val="3"/>
@@ -927,6 +941,8 @@
     <w:p>
       <w:pPr>
         <w:pStyle w:val="ListParagraph"/>
+        <w:keepNext w:val="false"/>
+        <w:keepLines w:val="false"/>
         <w:numPr>
           <w:ilvl w:val="0"/>
           <w:numId w:val="3"/>
@@ -947,6 +963,8 @@
     <w:p>
       <w:pPr>
         <w:pStyle w:val="ListParagraph"/>
+        <w:keepNext w:val="false"/>
+        <w:keepLines w:val="false"/>
         <w:numPr>
           <w:ilvl w:val="0"/>
           <w:numId w:val="3"/>
@@ -958,6 +976,28 @@
           <w:b/>
           <w:bCs/>
         </w:rPr>
+        <w:t xml:space="preserve">Equilibrio tra le sedi.</w:t>
+      </w:r>
+      <w:r>
+        <w:t xml:space="preserve"> Infine il programma può scambiare di sede due colleghi che hanno lo stesso turno, uno ad Acquasanta e l'altro a Venarotta, per pareggiare nel tempo i turni nelle due sedi (paragrafo 8.1).</w:t>
+      </w:r>
+    </w:p>
+    <w:p>
+      <w:pPr>
+        <w:pStyle w:val="ListParagraph"/>
+        <w:keepNext w:val="false"/>
+        <w:keepLines w:val="false"/>
+        <w:numPr>
+          <w:ilvl w:val="0"/>
+          <w:numId w:val="3"/>
+        </w:numPr>
+        <w:spacing w:after="80"/>
+      </w:pPr>
+      <w:r>
+        <w:rPr>
+          <w:b/>
+          <w:bCs/>
+        </w:rPr>
         <w:t xml:space="preserve">Controllo.</w:t>
       </w:r>
       <w:r>
@@ -967,6 +1007,8 @@
     <w:p>
       <w:pPr>
         <w:pStyle w:val="ListParagraph"/>
+        <w:keepNext w:val="false"/>
+        <w:keepLines w:val="false"/>
         <w:numPr>
           <w:ilvl w:val="0"/>
           <w:numId w:val="3"/>
@@ -982,26 +1024,6 @@
       </w:r>
       <w:r>
         <w:t xml:space="preserve"> Il responsabile conferma la settimana: da quel momento i turni sono definitivi.</w:t>
-      </w:r>
-    </w:p>
-    <w:p>
-      <w:pPr>
-        <w:pStyle w:val="ListParagraph"/>
-        <w:numPr>
-          <w:ilvl w:val="0"/>
-          <w:numId w:val="3"/>
-        </w:numPr>
-        <w:spacing w:after="80"/>
-      </w:pPr>
-      <w:r>
-        <w:rPr>
-          <w:b/>
-          <w:bCs/>
-        </w:rPr>
-        <w:t xml:space="preserve">Email.</w:t>
-      </w:r>
-      <w:r>
-        <w:t xml:space="preserve"> Ricevi un'email con i tuoi turni e il tabellone completo della settimana.</w:t>
       </w:r>
     </w:p>
     <w:p>
@@ -1014,7 +1036,7 @@
         <w:ind w:left="180" w:right="120"/>
       </w:pPr>
       <w:r>
-        <w:t xml:space="preserve">Finché la settimana non è confermata (è “in bozza”) i turni possono ancora cambiare. Fa fede la versione confermata che ricevi per email.</w:t>
+        <w:t xml:space="preserve">Finché la settimana non è confermata (è “in bozza”) i turni possono ancora cambiare. Fa fede la versione confermata.</w:t>
       </w:r>
     </w:p>
     <w:p>
@@ -4201,7 +4223,7 @@
         <w:spacing w:after="70"/>
       </w:pPr>
       <w:r>
-        <w:t xml:space="preserve">Ferie e malattia contano allo stesso modo; la differenza serve solo a indicarle correttamente (nell'email vedrai “Ferie” o “Malattia”).</w:t>
+        <w:t xml:space="preserve">Ferie e malattia contano allo stesso modo; la differenza serve solo a indicarle correttamente.</w:t>
       </w:r>
     </w:p>
     <w:p>
@@ -4960,6 +4982,26 @@
     </w:p>
     <w:p>
       <w:pPr>
+        <w:pStyle w:val="ListParagraph"/>
+        <w:numPr>
+          <w:ilvl w:val="0"/>
+          <w:numId w:val="2"/>
+        </w:numPr>
+        <w:spacing w:after="70"/>
+      </w:pPr>
+      <w:r>
+        <w:rPr>
+          <w:b/>
+          <w:bCs/>
+        </w:rPr>
+        <w:t xml:space="preserve">Acquasanta e Venarotta:</w:t>
+      </w:r>
+      <w:r>
+        <w:t xml:space="preserve"> nel tempo ognuno fa più o meno tanti turni in una sede quanti nell'altra (paragrafo 8.1).</w:t>
+      </w:r>
+    </w:p>
+    <w:p>
+      <w:pPr>
         <w:pBdr>
           <w:left w:val="single" w:color="009541" w:sz="24" w:space="8"/>
         </w:pBdr>
@@ -4978,7 +5020,7 @@
       </w:pPr>
       <w:bookmarkStart w:name="sez26" w:id="26"/>
       <w:r>
-        <w:t xml:space="preserve">8.1 Cosa conta di più</w:t>
+        <w:t xml:space="preserve">8.1 Equilibrio tra Acquasanta e Venarotta</w:t>
       </w:r>
       <w:bookmarkEnd w:id="26"/>
     </w:p>
@@ -4987,12 +5029,201 @@
         <w:spacing w:after="120"/>
       </w:pPr>
       <w:r>
+        <w:t xml:space="preserve">Nel tempo ogni dipendente dovrebbe fare più o meno </w:t>
+      </w:r>
+      <w:r>
+        <w:rPr>
+          <w:b/>
+          <w:bCs/>
+        </w:rPr>
+        <w:t xml:space="preserve">tanti turni ad Acquasanta quanti a Venarotta</w:t>
+      </w:r>
+      <w:r>
+        <w:t xml:space="preserve">. Ecco come ci arriva il programma:</w:t>
+      </w:r>
+    </w:p>
+    <w:p>
+      <w:pPr>
+        <w:pStyle w:val="ListParagraph"/>
+        <w:numPr>
+          <w:ilvl w:val="0"/>
+          <w:numId w:val="2"/>
+        </w:numPr>
+        <w:spacing w:after="70"/>
+      </w:pPr>
+      <w:r>
+        <w:t xml:space="preserve">Quando i turni della settimana sono stati decisi, il programma cerca le coppie di colleghi che fanno </w:t>
+      </w:r>
+      <w:r>
+        <w:rPr>
+          <w:b/>
+          <w:bCs/>
+        </w:rPr>
+        <w:t xml:space="preserve">lo stesso turno nello stesso giorno</w:t>
+      </w:r>
+      <w:r>
+        <w:t xml:space="preserve"> (stessa fascia, stesso orario, stesso ruolo), uno ad Acquasanta e l'altro a Venarotta, e può </w:t>
+      </w:r>
+      <w:r>
+        <w:rPr>
+          <w:b/>
+          <w:bCs/>
+        </w:rPr>
+        <w:t xml:space="preserve">scambiarli di sede</w:t>
+      </w:r>
+      <w:r>
+        <w:t xml:space="preserve">.</w:t>
+      </w:r>
+    </w:p>
+    <w:p>
+      <w:pPr>
+        <w:pStyle w:val="ListParagraph"/>
+        <w:numPr>
+          <w:ilvl w:val="0"/>
+          <w:numId w:val="2"/>
+        </w:numPr>
+        <w:spacing w:after="70"/>
+      </w:pPr>
+      <w:r>
+        <w:t xml:space="preserve">Lo scambio cambia </w:t>
+      </w:r>
+      <w:r>
+        <w:rPr>
+          <w:b/>
+          <w:bCs/>
+        </w:rPr>
+        <w:t xml:space="preserve">solo la sede</w:t>
+      </w:r>
+      <w:r>
+        <w:t xml:space="preserve">: orari, ore, riposi, notti e weekend restano esattamente gli stessi, quindi non peggiora nessun'altra regola.</w:t>
+      </w:r>
+    </w:p>
+    <w:p>
+      <w:pPr>
+        <w:pStyle w:val="ListParagraph"/>
+        <w:numPr>
+          <w:ilvl w:val="0"/>
+          <w:numId w:val="2"/>
+        </w:numPr>
+        <w:spacing w:after="70"/>
+      </w:pPr>
+      <w:r>
+        <w:t xml:space="preserve">Il conteggio comprende </w:t>
+      </w:r>
+      <w:r>
+        <w:rPr>
+          <w:b/>
+          <w:bCs/>
+        </w:rPr>
+        <w:t xml:space="preserve">anche le settimane passate</w:t>
+      </w:r>
+      <w:r>
+        <w:t xml:space="preserve">: chi finora ha fatto più turni ad Acquasanta tende ad andare a Venarotta, e viceversa. Anche mezzo turno conta come un turno.</w:t>
+      </w:r>
+    </w:p>
+    <w:p>
+      <w:pPr>
+        <w:pStyle w:val="ListParagraph"/>
+        <w:numPr>
+          <w:ilvl w:val="0"/>
+          <w:numId w:val="2"/>
+        </w:numPr>
+        <w:spacing w:after="70"/>
+      </w:pPr>
+      <w:r>
+        <w:t xml:space="preserve">Lo scambio non avviene mai verso una sede che per te è esclusa (divieto di postazione).</w:t>
+      </w:r>
+    </w:p>
+    <w:p>
+      <w:pPr>
+        <w:pStyle w:val="ListParagraph"/>
+        <w:numPr>
+          <w:ilvl w:val="0"/>
+          <w:numId w:val="2"/>
+        </w:numPr>
+        <w:spacing w:after="70"/>
+      </w:pPr>
+      <w:r>
+        <w:t xml:space="preserve">Vengono scambiati solo i turni assegnati dal programma: quelli assegnati a mano restano dove sono, ma contano nel conteggio.</w:t>
+      </w:r>
+    </w:p>
+    <w:p>
+      <w:pPr>
+        <w:pStyle w:val="ListParagraph"/>
+        <w:numPr>
+          <w:ilvl w:val="0"/>
+          <w:numId w:val="2"/>
+        </w:numPr>
+        <w:spacing w:after="70"/>
+      </w:pPr>
+      <w:r>
+        <w:t xml:space="preserve">Se lo stesso equilibrio si può ottenere in più modi, il programma fa il minor numero di scambi possibile.</w:t>
+      </w:r>
+    </w:p>
+    <w:p>
+      <w:pPr>
+        <w:pStyle w:val="ListParagraph"/>
+        <w:numPr>
+          <w:ilvl w:val="0"/>
+          <w:numId w:val="2"/>
+        </w:numPr>
+        <w:spacing w:after="70"/>
+      </w:pPr>
+      <w:r>
+        <w:t xml:space="preserve">Non riguarda Ascoli, che ha regole proprie (capitolo 7), né Standby e Programmati.</w:t>
+      </w:r>
+    </w:p>
+    <w:p>
+      <w:pPr>
+        <w:pStyle w:val="ListParagraph"/>
+        <w:numPr>
+          <w:ilvl w:val="0"/>
+          <w:numId w:val="2"/>
+        </w:numPr>
+        <w:spacing w:after="70"/>
+      </w:pPr>
+      <w:r>
+        <w:t xml:space="preserve">Nelle statistiche il responsabile vede, per ognuno, quanti turni ha fatto ad Acquasanta e quanti a Venarotta.</w:t>
+      </w:r>
+    </w:p>
+    <w:p>
+      <w:pPr>
+        <w:pBdr>
+          <w:left w:val="single" w:color="009541" w:sz="24" w:space="8"/>
+        </w:pBdr>
+        <w:shd w:fill="E8F5EC" w:color="auto" w:val="clear"/>
+        <w:spacing w:after="180" w:before="120"/>
+        <w:ind w:left="180" w:right="120"/>
+      </w:pPr>
+      <w:r>
+        <w:t xml:space="preserve">Uno scambio è possibile solo se nello stesso giorno c'è un collega con lo stesso turno nell'altra sede: per questo l'equilibrio tra le due sedi si raggiunge nel corso delle settimane, non sempre in una sola.</w:t>
+      </w:r>
+    </w:p>
+    <w:p>
+      <w:pPr>
+        <w:pStyle w:val="Heading2"/>
+        <w:keepNext/>
+      </w:pPr>
+      <w:bookmarkStart w:name="sez27" w:id="27"/>
+      <w:r>
+        <w:t xml:space="preserve">8.2 Cosa conta di più</w:t>
+      </w:r>
+      <w:bookmarkEnd w:id="27"/>
+    </w:p>
+    <w:p>
+      <w:pPr>
+        <w:keepNext/>
+        <w:spacing w:after="120"/>
+      </w:pPr>
+      <w:r>
         <w:t xml:space="preserve">Quando non si può avere tutto, il programma segue in linea di massima questo ordine di importanza:</w:t>
       </w:r>
     </w:p>
     <w:p>
       <w:pPr>
         <w:pStyle w:val="ListParagraph"/>
+        <w:keepNext/>
+        <w:keepLines/>
         <w:numPr>
           <w:ilvl w:val="0"/>
           <w:numId w:val="4"/>
@@ -5006,6 +5237,8 @@
     <w:p>
       <w:pPr>
         <w:pStyle w:val="ListParagraph"/>
+        <w:keepNext/>
+        <w:keepLines/>
         <w:numPr>
           <w:ilvl w:val="0"/>
           <w:numId w:val="4"/>
@@ -5019,6 +5252,8 @@
     <w:p>
       <w:pPr>
         <w:pStyle w:val="ListParagraph"/>
+        <w:keepNext/>
+        <w:keepLines/>
         <w:numPr>
           <w:ilvl w:val="0"/>
           <w:numId w:val="4"/>
@@ -5032,6 +5267,8 @@
     <w:p>
       <w:pPr>
         <w:pStyle w:val="ListParagraph"/>
+        <w:keepNext/>
+        <w:keepLines/>
         <w:numPr>
           <w:ilvl w:val="0"/>
           <w:numId w:val="4"/>
@@ -5045,6 +5282,8 @@
     <w:p>
       <w:pPr>
         <w:pStyle w:val="ListParagraph"/>
+        <w:keepNext/>
+        <w:keepLines/>
         <w:numPr>
           <w:ilvl w:val="0"/>
           <w:numId w:val="4"/>
@@ -5058,6 +5297,8 @@
     <w:p>
       <w:pPr>
         <w:pStyle w:val="ListParagraph"/>
+        <w:keepNext/>
+        <w:keepLines/>
         <w:numPr>
           <w:ilvl w:val="0"/>
           <w:numId w:val="4"/>
@@ -5071,6 +5312,8 @@
     <w:p>
       <w:pPr>
         <w:pStyle w:val="ListParagraph"/>
+        <w:keepNext/>
+        <w:keepLines/>
         <w:numPr>
           <w:ilvl w:val="0"/>
           <w:numId w:val="4"/>
@@ -5084,6 +5327,8 @@
     <w:p>
       <w:pPr>
         <w:pStyle w:val="ListParagraph"/>
+        <w:keepNext w:val="false"/>
+        <w:keepLines/>
         <w:numPr>
           <w:ilvl w:val="0"/>
           <w:numId w:val="4"/>
@@ -5092,6 +5337,14 @@
       </w:pPr>
       <w:r>
         <w:t xml:space="preserve">equilibrare giorni e notti.</w:t>
+      </w:r>
+    </w:p>
+    <w:p>
+      <w:pPr>
+        <w:spacing w:after="120"/>
+      </w:pPr>
+      <w:r>
+        <w:t xml:space="preserve">Solo alla fine, a turni decisi, il programma pareggia Acquasanta e Venarotta con gli scambi del paragrafo 8.1, senza cambiare nient'altro.</w:t>
       </w:r>
     </w:p>
     <w:p>
@@ -5099,138 +5352,9 @@
         <w:pStyle w:val="Heading1"/>
         <w:keepNext/>
       </w:pPr>
-      <w:bookmarkStart w:name="sez27" w:id="27"/>
-      <w:r>
-        <w:t xml:space="preserve">9. Come ricevi i turni</w:t>
-      </w:r>
-      <w:bookmarkEnd w:id="27"/>
-    </w:p>
-    <w:p>
-      <w:pPr>
-        <w:pStyle w:val="ListParagraph"/>
-        <w:numPr>
-          <w:ilvl w:val="0"/>
-          <w:numId w:val="2"/>
-        </w:numPr>
-        <w:spacing w:after="70"/>
-      </w:pPr>
-      <w:r>
-        <w:t xml:space="preserve">Dopo la conferma della settimana il responsabile invia le email. </w:t>
-      </w:r>
-      <w:r>
-        <w:rPr>
-          <w:b/>
-          <w:bCs/>
-        </w:rPr>
-        <w:t xml:space="preserve">Ricevi un'email solo se quella settimana hai almeno un turno.</w:t>
-      </w:r>
-      <w:r>
-        <w:t xml:space="preserve"> Assicurati che il responsabile abbia il tuo indirizzo email.</w:t>
-      </w:r>
-    </w:p>
-    <w:p>
-      <w:pPr>
-        <w:pStyle w:val="ListParagraph"/>
-        <w:numPr>
-          <w:ilvl w:val="0"/>
-          <w:numId w:val="2"/>
-        </w:numPr>
-        <w:spacing w:after="70"/>
-      </w:pPr>
-      <w:r>
-        <w:t xml:space="preserve">L'email contiene </w:t>
-      </w:r>
-      <w:r>
-        <w:rPr>
-          <w:b/>
-          <w:bCs/>
-        </w:rPr>
-        <w:t xml:space="preserve">i tuoi turni giorno per giorno</w:t>
-      </w:r>
-      <w:r>
-        <w:t xml:space="preserve"> (orario, postazione e ruolo), con “Riposo”, “Ferie” o “Malattia” nei giorni senza turni, e sotto </w:t>
-      </w:r>
-      <w:r>
-        <w:rPr>
-          <w:b/>
-          <w:bCs/>
-        </w:rPr>
-        <w:t xml:space="preserve">il tabellone completo</w:t>
-      </w:r>
-      <w:r>
-        <w:t xml:space="preserve"> della settimana con tutti i colleghi.</w:t>
-      </w:r>
-    </w:p>
-    <w:p>
-      <w:pPr>
-        <w:pStyle w:val="ListParagraph"/>
-        <w:numPr>
-          <w:ilvl w:val="0"/>
-          <w:numId w:val="2"/>
-        </w:numPr>
-        <w:spacing w:after="70"/>
-      </w:pPr>
-      <w:r>
-        <w:t xml:space="preserve">L'oggetto è del tipo “Turni dal 26/10 al 01/11/2026”.</w:t>
-      </w:r>
-    </w:p>
-    <w:p>
-      <w:pPr>
-        <w:pStyle w:val="ListParagraph"/>
-        <w:numPr>
-          <w:ilvl w:val="0"/>
-          <w:numId w:val="2"/>
-        </w:numPr>
-        <w:spacing w:after="70"/>
-      </w:pPr>
-      <w:r>
-        <w:t xml:space="preserve">Se dopo l'invio i tuoi turni cambiano, ricevi un'email con oggetto </w:t>
-      </w:r>
-      <w:r>
-        <w:rPr>
-          <w:b/>
-          <w:bCs/>
-        </w:rPr>
-        <w:t xml:space="preserve">“AGGIORNAMENTO turni…”</w:t>
-      </w:r>
-      <w:r>
-        <w:t xml:space="preserve">. Se i tuoi turni non cambiano, di norma non ricevi nulla di nuovo. Se avevi turni e ti vengono tolti tutti, ricevi comunque l'aggiornamento.</w:t>
-      </w:r>
-    </w:p>
-    <w:p>
-      <w:pPr>
-        <w:pStyle w:val="ListParagraph"/>
-        <w:numPr>
-          <w:ilvl w:val="0"/>
-          <w:numId w:val="2"/>
-        </w:numPr>
-        <w:spacing w:after="70"/>
-      </w:pPr>
-      <w:r>
-        <w:t xml:space="preserve">Nel tabellone i mezzi turni riportano l'orario e un posto ancora da coprire compare come “scoperto”.</w:t>
-      </w:r>
-    </w:p>
-    <w:p>
-      <w:pPr>
-        <w:pStyle w:val="ListParagraph"/>
-        <w:numPr>
-          <w:ilvl w:val="0"/>
-          <w:numId w:val="2"/>
-        </w:numPr>
-        <w:spacing w:after="70"/>
-      </w:pPr>
-      <w:r>
-        <w:t xml:space="preserve">Il responsabile può anche stampare il tabellone della settimana e i turni del singolo dipendente.</w:t>
-      </w:r>
-    </w:p>
-    <w:p>
-      <w:pPr>
-        <w:pStyle w:val="Heading1"/>
-        <w:keepNext/>
-      </w:pPr>
       <w:bookmarkStart w:name="sez28" w:id="28"/>
       <w:r>
-        <w:t xml:space="preserve">10. Domande frequenti</w:t>
+        <w:t xml:space="preserve">9. Domande frequenti</w:t>
       </w:r>
       <w:bookmarkEnd w:id="28"/>
     </w:p>
@@ -5311,7 +5435,7 @@
           <w:bCs/>
           <w:color w:val="00672D"/>
         </w:rPr>
-        <w:t xml:space="preserve">Sono stato in ferie o in malattia: devo recuperare le ore?</w:t>
+        <w:t xml:space="preserve">Ho avuto ferie o malattia: devo recuperare le ore?</w:t>
       </w:r>
     </w:p>
     <w:p>
@@ -5363,7 +5487,7 @@
         <w:spacing w:after="120"/>
       </w:pPr>
       <w:r>
-        <w:t xml:space="preserve">Avvisa il responsabile, che registra la malattia. Il programma segnala che hai turni in un giorno di malattia; il responsabile riapre la settimana, sistema i turni e chi ha i turni cambiati riceve l'email di aggiornamento.</w:t>
+        <w:t xml:space="preserve">Avvisa il responsabile, che registra la malattia. Il programma segnala che hai turni in un giorno di malattia; il responsabile riapre la settimana e sistema i turni.</w:t>
       </w:r>
     </w:p>
     <w:p>
@@ -5377,7 +5501,7 @@
           <w:bCs/>
           <w:color w:val="00672D"/>
         </w:rPr>
-        <w:t xml:space="preserve">Perché non ho ricevuto l'email dei turni?</w:t>
+        <w:t xml:space="preserve">Perché faccio più turni a Venarotta che ad Acquasanta, o viceversa?</w:t>
       </w:r>
     </w:p>
     <w:p>
@@ -5385,7 +5509,7 @@
         <w:spacing w:after="120"/>
       </w:pPr>
       <w:r>
-        <w:t xml:space="preserve">L'email arriva solo se quella settimana hai almeno un turno, se il responsabile ha il tuo indirizzo email e dopo che la settimana è stata confermata. Controlla anche la posta indesiderata.</w:t>
+        <w:t xml:space="preserve">Il programma pareggia le due sedi nel tempo, scambiando colleghi che hanno lo stesso turno nello stesso giorno. Non in tutte le settimane c'è uno scambio possibile (serve un collega con lo stesso turno nell'altra sede e senza divieti per quella sede), quindi l'equilibrio si raggiunge nel corso delle settimane.</w:t>
       </w:r>
     </w:p>
     <w:p>
@@ -5462,7 +5586,7 @@
       </w:pPr>
       <w:bookmarkStart w:name="sez29" w:id="29"/>
       <w:r>
-        <w:t xml:space="preserve">11. Le regole in una pagina</w:t>
+        <w:t xml:space="preserve">10. Le regole in una pagina</w:t>
       </w:r>
       <w:bookmarkEnd w:id="29"/>
     </w:p>
@@ -6378,7 +6502,7 @@
                 <w:sz w:val="20"/>
                 <w:szCs w:val="20"/>
               </w:rPr>
-              <w:t xml:space="preserve">Equità nel tempo</w:t>
+              <w:t xml:space="preserve">Acquasanta e Venarotta</w:t>
             </w:r>
           </w:p>
         </w:tc>
@@ -6408,7 +6532,7 @@
                 <w:sz w:val="20"/>
                 <w:szCs w:val="20"/>
               </w:rPr>
-              <w:t xml:space="preserve">Ore, notti, weekend e turni speciali bilanciati nel corso delle settimane</w:t>
+              <w:t xml:space="preserve">Nel tempo, tanti turni in una sede quanti nell'altra: scambi tra colleghi con lo stesso turno, senza cambiare orari né ore</w:t>
             </w:r>
           </w:p>
         </w:tc>
@@ -6444,7 +6568,7 @@
                 <w:sz w:val="20"/>
                 <w:szCs w:val="20"/>
               </w:rPr>
-              <w:t xml:space="preserve">Volontari</w:t>
+              <w:t xml:space="preserve">Equità nel tempo</w:t>
             </w:r>
           </w:p>
         </w:tc>
@@ -6475,7 +6599,7 @@
                 <w:sz w:val="20"/>
                 <w:szCs w:val="20"/>
               </w:rPr>
-              <w:t xml:space="preserve">Scelgono i propri turni; il programma non li sposta e assegna ai dipendenti i posti rimasti</w:t>
+              <w:t xml:space="preserve">Ore, notti, weekend e turni speciali bilanciati nel corso delle settimane</w:t>
             </w:r>
           </w:p>
         </w:tc>
@@ -6510,7 +6634,7 @@
                 <w:sz w:val="20"/>
                 <w:szCs w:val="20"/>
               </w:rPr>
-              <w:t xml:space="preserve">Comunicazione dei turni</w:t>
+              <w:t xml:space="preserve">Volontari</w:t>
             </w:r>
           </w:p>
         </w:tc>
@@ -6540,7 +6664,7 @@
                 <w:sz w:val="20"/>
                 <w:szCs w:val="20"/>
               </w:rPr>
-              <w:t xml:space="preserve">Email dopo la conferma; “AGGIORNAMENTO” se i tuoi turni cambiano</w:t>
+              <w:t xml:space="preserve">Scelgono i propri turni; il programma non li sposta e assegna ai dipendenti i posti rimasti</w:t>
             </w:r>
           </w:p>
         </w:tc>

</xml_diff>